<commit_message>
Review WRRA-M 0.10–0.12 and publish all English editions
Preserve all frozen calibration inputs and original numerical outputs. Carry the failed slow-clock/SI-phase identification into 0.10 and 0.11; distinguish 57 accelerated events from 56 completed updates; qualify the two-mode overlap; replace the formal infinitesimal-generator statement with a finite positive-step norm bound. Update all six bilingual manuscripts, native equations, PDFs and reproducibility packages. All 96 distinct component checks and 9 cross-version review groups pass, and all 32 PDF pages were inspected. Preserve upstream 0.7 and earlier research records. Published Zenodo DOI: 10.5281/zenodo.23113101.
</commit_message>
<xml_diff>
--- a/paper/WRRA_M_0_10_EN.docx
+++ b/paper/WRRA_M_0_10_EN.docx
@@ -43,7 +43,7 @@
         <w:jc w:val="left"/>
       </w:pPr>
       <w:r>
-        <w:t xml:space="preserve">2026-10-02 · WRRA-M 0.10</w:t>
+        <w:t xml:space="preserve">2026-10-03 · WRRA-M 0.10-r1</w:t>
       </w:r>
     </w:p>
     <w:p>
@@ -2614,7 +2614,7 @@
         <w:jc w:val="left"/>
       </w:pPr>
       <w:r>
-        <w:t xml:space="preserve">At fixed volume, the energy operator divided by E_star=ucrit V0 generates updates in dimensionless clock coordinate tau. This inherits a constitutive clock and does not replace the later shutter-to-proper-time calculation. Noncommuting Kc and Kb transfer energy between D and R, with zero total internal exchange.</w:t>
+        <w:t xml:space="preserve">At fixed volume, the energy operator divided by E_star=ucrit V0 generates updates in dimensionless clock coordinate xi. This inherits a constitutive clock and does not replace the later shutter-to-proper-time calculation. Noncommuting Kc and Kb transfer energy between D and R, with zero total internal exchange.</w:t>
       </w:r>
     </w:p>
     <w:p>
@@ -2663,7 +2663,7 @@
                   </m:dPr>
                   <m:e>
                     <m:r>
-                      <m:t>τ</m:t>
+                      <m:t>ξ</m:t>
                     </m:r>
                   </m:e>
                 </m:d>
@@ -2692,7 +2692,7 @@
                       <m:t>i</m:t>
                     </m:r>
                     <m:r>
-                      <m:t>τ</m:t>
+                      <m:t>ξ</m:t>
                     </m:r>
                     <m:acc>
                       <m:accPr>
@@ -2748,7 +2748,7 @@
                   </m:dPr>
                   <m:e>
                     <m:r>
-                      <m:t>τ</m:t>
+                      <m:t>ξ</m:t>
                     </m:r>
                   </m:e>
                 </m:d>
@@ -2815,7 +2815,7 @@
                       <m:t>d</m:t>
                     </m:r>
                     <m:r>
-                      <m:t>τ</m:t>
+                      <m:t>ξ</m:t>
                     </m:r>
                   </m:den>
                 </m:f>
@@ -2939,7 +2939,7 @@
                           <m:t>d</m:t>
                         </m:r>
                         <m:r>
-                          <m:t>τ</m:t>
+                          <m:t>ξ</m:t>
                         </m:r>
                       </m:den>
                     </m:f>
@@ -2975,12 +2975,22 @@
     <w:p>
       <w:pPr>
         <w:pStyle w:val="FirstParagraph"/>
+        <w:ind w:firstLine="0"/>
+        <w:jc w:val="left"/>
+      </w:pPr>
+      <w:r>
+        <w:t xml:space="preserve">The expansion test integrates the normalized energy generator against log a using the slow constitutive schedule dxi/dt=omega_info, and calculates H from energy density. Pressure is the same volume derivative. At fixed address configuration, cancellation of state exchange gives the continuity relation. The homogeneous flat background and local lens condition retain the scope of the inherited implementation.</w:t>
+      </w:r>
+    </w:p>
+    <w:p>
+      <w:pPr>
+        <w:pStyle w:val="BodyText"/>
         <w:keepNext/>
         <w:ind w:firstLine="0"/>
         <w:jc w:val="left"/>
       </w:pPr>
       <w:r>
-        <w:t xml:space="preserve">The expansion test integrates the same generator against log a and calculates H from energy density. Pressure is the same volume derivative. At fixed address configuration, cancellation of state exchange gives the continuity relation. The homogeneous flat background and local lens condition retain the scope of the inherited implementation.</w:t>
+        <w:t xml:space="preserve">Revision r1 incorporates the clock comparison executed in 0.12. At fixed volume xi=E_star tau_phys/hbar gives exactly the same SI energy phase. However, the expansion schedule omega_info=0.7H0 is about 2.10×10⁻⁴³ of E_star/hbar. The old nonuniform histories remain outputs of a slow constitutive schedule and are not identified with physical proper-time evolution of the SI Hamiltonian. Expansion of the uniform I/N state and energy, pressure and local-gravity reproduction are retained.</w:t>
       </w:r>
     </w:p>
     <w:p>
@@ -5176,6 +5186,16 @@
         <w:jc w:val="left"/>
       </w:pPr>
       <w:r>
+        <w:t xml:space="preserve">Reviewed 0.10 to 0.12 series DOI 10.5281/zenodo.23113101 · https://doi.org/10.5281/zenodo.23113101</w:t>
+      </w:r>
+    </w:p>
+    <w:p>
+      <w:pPr>
+        <w:pStyle w:val="BodyText"/>
+        <w:ind w:firstLine="0"/>
+        <w:jc w:val="left"/>
+      </w:pPr>
+      <w:r>
         <w:t xml:space="preserve">Input SHA256 8342c02c3d872994b13c54c9512d6e7440a45e7ef9602cb1ac4ebe34eddb540f</w:t>
       </w:r>
     </w:p>
@@ -5219,6 +5239,7 @@
     <w:p>
       <w:pPr>
         <w:pStyle w:val="Heading2"/>
+        <w:keepNext/>
         <w:ind w:firstLine="0"/>
         <w:jc w:val="left"/>
       </w:pPr>
@@ -5232,6 +5253,7 @@
     <w:p>
       <w:pPr>
         <w:pStyle w:val="FirstParagraph"/>
+        <w:keepNext/>
         <w:spacing w:line="240" w:lineRule="auto" w:after="60"/>
         <w:ind w:firstLine="0"/>
         <w:jc w:val="left"/>
@@ -5246,6 +5268,7 @@
     <w:p>
       <w:pPr>
         <w:pStyle w:val="BodyText"/>
+        <w:keepNext/>
         <w:spacing w:line="240" w:lineRule="auto" w:after="60"/>
         <w:ind w:firstLine="0"/>
         <w:jc w:val="left"/>
@@ -5260,6 +5283,7 @@
     <w:p>
       <w:pPr>
         <w:pStyle w:val="BodyText"/>
+        <w:keepNext/>
         <w:spacing w:line="240" w:lineRule="auto" w:after="60"/>
         <w:ind w:firstLine="0"/>
         <w:jc w:val="left"/>
@@ -5274,6 +5298,7 @@
     <w:p>
       <w:pPr>
         <w:pStyle w:val="BodyText"/>
+        <w:keepNext w:val="0"/>
         <w:spacing w:line="240" w:lineRule="auto" w:after="60"/>
         <w:ind w:firstLine="0"/>
         <w:jc w:val="left"/>

</xml_diff>